<commit_message>
created inclass activity unit 2 part 1
</commit_message>
<xml_diff>
--- a/Unit 1/Unit1Exercise.docx
+++ b/Unit 1/Unit1Exercise.docx
@@ -593,6 +593,15 @@
                 <w:color w:val="EE0000"/>
               </w:rPr>
             </w:pPr>
+            <w:r>
+              <w:rPr>
+                <w:rFonts w:ascii="Arial" w:hAnsi="Arial" w:cs="Arial"/>
+                <w:b/>
+                <w:bCs/>
+                <w:color w:val="EE0000"/>
+              </w:rPr>
+              <w:t>5</w:t>
+            </w:r>
           </w:p>
         </w:tc>
         <w:tc>
@@ -613,6 +622,15 @@
                 <w:color w:val="EE0000"/>
               </w:rPr>
             </w:pPr>
+            <w:r>
+              <w:rPr>
+                <w:rFonts w:ascii="Arial" w:hAnsi="Arial" w:cs="Arial"/>
+                <w:b/>
+                <w:bCs/>
+                <w:color w:val="EE0000"/>
+              </w:rPr>
+              <w:t>300</w:t>
+            </w:r>
           </w:p>
         </w:tc>
         <w:tc>
@@ -633,6 +651,15 @@
                 <w:color w:val="EE0000"/>
               </w:rPr>
             </w:pPr>
+            <w:r>
+              <w:rPr>
+                <w:rFonts w:ascii="Arial" w:hAnsi="Arial" w:cs="Arial"/>
+                <w:b/>
+                <w:bCs/>
+                <w:color w:val="EE0000"/>
+              </w:rPr>
+              <w:t>18,000</w:t>
+            </w:r>
           </w:p>
         </w:tc>
       </w:tr>
@@ -698,6 +725,15 @@
                 <w:color w:val="EE0000"/>
               </w:rPr>
             </w:pPr>
+            <w:r>
+              <w:rPr>
+                <w:rFonts w:ascii="Arial" w:hAnsi="Arial" w:cs="Arial"/>
+                <w:b/>
+                <w:bCs/>
+                <w:color w:val="EE0000"/>
+              </w:rPr>
+              <w:t>7</w:t>
+            </w:r>
           </w:p>
         </w:tc>
         <w:tc>
@@ -715,6 +751,15 @@
                 <w:color w:val="EE0000"/>
               </w:rPr>
             </w:pPr>
+            <w:r>
+              <w:rPr>
+                <w:rFonts w:ascii="Arial" w:hAnsi="Arial" w:cs="Arial"/>
+                <w:b/>
+                <w:bCs/>
+                <w:color w:val="EE0000"/>
+              </w:rPr>
+              <w:t>54</w:t>
+            </w:r>
           </w:p>
         </w:tc>
         <w:tc>
@@ -732,6 +777,15 @@
                 <w:color w:val="EE0000"/>
               </w:rPr>
             </w:pPr>
+            <w:r>
+              <w:rPr>
+                <w:rFonts w:ascii="Arial" w:hAnsi="Arial" w:cs="Arial"/>
+                <w:b/>
+                <w:bCs/>
+                <w:color w:val="EE0000"/>
+              </w:rPr>
+              <w:t>424</w:t>
+            </w:r>
           </w:p>
         </w:tc>
       </w:tr>
@@ -809,6 +863,15 @@
                 <w:color w:val="EE0000"/>
               </w:rPr>
             </w:pPr>
+            <w:r>
+              <w:rPr>
+                <w:rFonts w:ascii="Arial" w:hAnsi="Arial" w:cs="Arial"/>
+                <w:b/>
+                <w:bCs/>
+                <w:color w:val="EE0000"/>
+              </w:rPr>
+              <w:t xml:space="preserve">12 </w:t>
+            </w:r>
           </w:p>
         </w:tc>
         <w:tc>
@@ -829,6 +892,15 @@
                 <w:color w:val="EE0000"/>
               </w:rPr>
             </w:pPr>
+            <w:r>
+              <w:rPr>
+                <w:rFonts w:ascii="Arial" w:hAnsi="Arial" w:cs="Arial"/>
+                <w:b/>
+                <w:bCs/>
+                <w:color w:val="EE0000"/>
+              </w:rPr>
+              <w:t>18</w:t>
+            </w:r>
           </w:p>
         </w:tc>
         <w:tc>
@@ -849,6 +921,15 @@
                 <w:color w:val="EE0000"/>
               </w:rPr>
             </w:pPr>
+            <w:r>
+              <w:rPr>
+                <w:rFonts w:ascii="Arial" w:hAnsi="Arial" w:cs="Arial"/>
+                <w:b/>
+                <w:bCs/>
+                <w:color w:val="EE0000"/>
+              </w:rPr>
+              <w:t>24</w:t>
+            </w:r>
           </w:p>
         </w:tc>
       </w:tr>
@@ -1070,6 +1151,12 @@
                 <w:color w:val="EE0000"/>
               </w:rPr>
             </w:pPr>
+            <w:r>
+              <w:rPr>
+                <w:color w:val="EE0000"/>
+              </w:rPr>
+              <w:t>50</w:t>
+            </w:r>
           </w:p>
         </w:tc>
         <w:tc>
@@ -1087,6 +1174,24 @@
                 <w:color w:val="EE0000"/>
               </w:rPr>
             </w:pPr>
+            <w:r>
+              <w:rPr>
+                <w:color w:val="EE0000"/>
+              </w:rPr>
+              <w:t>3</w:t>
+            </w:r>
+            <w:r>
+              <w:rPr>
+                <w:color w:val="EE0000"/>
+              </w:rPr>
+              <w:t>,</w:t>
+            </w:r>
+            <w:r>
+              <w:rPr>
+                <w:color w:val="EE0000"/>
+              </w:rPr>
+              <w:t>000</w:t>
+            </w:r>
           </w:p>
         </w:tc>
         <w:tc>
@@ -1104,6 +1209,12 @@
                 <w:color w:val="EE0000"/>
               </w:rPr>
             </w:pPr>
+            <w:r>
+              <w:rPr>
+                <w:color w:val="EE0000"/>
+              </w:rPr>
+              <w:t>180,000</w:t>
+            </w:r>
           </w:p>
         </w:tc>
       </w:tr>
@@ -1166,6 +1277,12 @@
                 <w:color w:val="EE0000"/>
               </w:rPr>
             </w:pPr>
+            <w:r>
+              <w:rPr>
+                <w:color w:val="EE0000"/>
+              </w:rPr>
+              <w:t>22</w:t>
+            </w:r>
           </w:p>
         </w:tc>
         <w:tc>
@@ -1180,6 +1297,12 @@
                 <w:color w:val="EE0000"/>
               </w:rPr>
             </w:pPr>
+            <w:r>
+              <w:rPr>
+                <w:color w:val="EE0000"/>
+              </w:rPr>
+              <w:t>173</w:t>
+            </w:r>
           </w:p>
         </w:tc>
         <w:tc>
@@ -1194,6 +1317,12 @@
                 <w:color w:val="EE0000"/>
               </w:rPr>
             </w:pPr>
+            <w:r>
+              <w:rPr>
+                <w:color w:val="EE0000"/>
+              </w:rPr>
+              <w:t>1,341</w:t>
+            </w:r>
           </w:p>
         </w:tc>
       </w:tr>
@@ -1268,6 +1397,12 @@
                 <w:color w:val="EE0000"/>
               </w:rPr>
             </w:pPr>
+            <w:r>
+              <w:rPr>
+                <w:color w:val="EE0000"/>
+              </w:rPr>
+              <w:t>15</w:t>
+            </w:r>
           </w:p>
         </w:tc>
         <w:tc>
@@ -1285,6 +1420,12 @@
                 <w:color w:val="EE0000"/>
               </w:rPr>
             </w:pPr>
+            <w:r>
+              <w:rPr>
+                <w:color w:val="EE0000"/>
+              </w:rPr>
+              <w:t>21</w:t>
+            </w:r>
           </w:p>
         </w:tc>
         <w:tc>
@@ -1302,6 +1443,12 @@
                 <w:color w:val="EE0000"/>
               </w:rPr>
             </w:pPr>
+            <w:r>
+              <w:rPr>
+                <w:color w:val="EE0000"/>
+              </w:rPr>
+              <w:t>27</w:t>
+            </w:r>
           </w:p>
         </w:tc>
       </w:tr>
@@ -1314,6 +1461,19 @@
     </w:p>
     <w:p>
       <w:pPr>
+        <w:rPr>
+          <w:color w:val="EE0000"/>
+        </w:rPr>
+      </w:pPr>
+      <w:r>
+        <w:rPr>
+          <w:color w:val="EE0000"/>
+        </w:rPr>
+        <w:t xml:space="preserve">Algorithm A is the faster for larger inputs, where C is faster for smaller inputs. </w:t>
+      </w:r>
+    </w:p>
+    <w:p>
+      <w:pPr>
         <w:spacing w:before="120"/>
       </w:pPr>
       <w:r>
@@ -1326,9 +1486,44 @@
     <w:p>
       <w:pPr>
         <w:spacing w:before="120"/>
-      </w:pPr>
-      <w:r>
+        <w:rPr>
+          <w:color w:val="EE0000"/>
+        </w:rPr>
+      </w:pPr>
+      <w:r>
+        <w:rPr>
+          <w:color w:val="EE0000"/>
+        </w:rPr>
+        <w:t xml:space="preserve">Algorithm A benefits the most from the faster processor as it by a factor of 10x in every column. </w:t>
+      </w:r>
+    </w:p>
+    <w:p>
+      <w:pPr>
+        <w:spacing w:before="120"/>
+      </w:pPr>
+      <w:r>
+        <w:lastRenderedPageBreak/>
         <w:t>What did you observe from this exercise regarding comparing algorithms of various time complexities?</w:t>
+      </w:r>
+    </w:p>
+    <w:p>
+      <w:pPr>
+        <w:spacing w:before="120"/>
+        <w:rPr>
+          <w:color w:val="EE0000"/>
+        </w:rPr>
+      </w:pPr>
+      <w:r>
+        <w:rPr>
+          <w:color w:val="EE0000"/>
+        </w:rPr>
+        <w:t>Growth rate matters more than processor speed because a faster processor only reduces running time by a constant factor</w:t>
+      </w:r>
+      <w:r>
+        <w:rPr>
+          <w:color w:val="EE0000"/>
+        </w:rPr>
+        <w:t xml:space="preserve">, not changing how it scales with N. A better algorithm will always beat better hardware. </w:t>
       </w:r>
     </w:p>
     <w:p/>
@@ -1348,7 +1543,6 @@
           <w:sz w:val="24"/>
           <w:szCs w:val="16"/>
         </w:rPr>
-        <w:lastRenderedPageBreak/>
         <w:t>Note!</w:t>
       </w:r>
       <w:r>
@@ -1572,6 +1766,32 @@
                 <w:szCs w:val="26"/>
               </w:rPr>
             </w:pPr>
+            <w:proofErr w:type="gramStart"/>
+            <w:r>
+              <w:rPr>
+                <w:b/>
+                <w:bCs/>
+                <w:i/>
+                <w:iCs/>
+                <w:color w:val="EE0000"/>
+                <w:sz w:val="26"/>
+                <w:szCs w:val="26"/>
+              </w:rPr>
+              <w:t>O(</w:t>
+            </w:r>
+            <w:proofErr w:type="gramEnd"/>
+            <w:r>
+              <w:rPr>
+                <w:b/>
+                <w:bCs/>
+                <w:i/>
+                <w:iCs/>
+                <w:color w:val="EE0000"/>
+                <w:sz w:val="26"/>
+                <w:szCs w:val="26"/>
+              </w:rPr>
+              <w:t>1)</w:t>
+            </w:r>
           </w:p>
         </w:tc>
       </w:tr>
@@ -1623,6 +1843,32 @@
                 <w:szCs w:val="26"/>
               </w:rPr>
             </w:pPr>
+            <w:proofErr w:type="gramStart"/>
+            <w:r>
+              <w:rPr>
+                <w:b/>
+                <w:bCs/>
+                <w:i/>
+                <w:iCs/>
+                <w:color w:val="EE0000"/>
+                <w:sz w:val="26"/>
+                <w:szCs w:val="26"/>
+              </w:rPr>
+              <w:t>O(</w:t>
+            </w:r>
+            <w:proofErr w:type="gramEnd"/>
+            <w:r>
+              <w:rPr>
+                <w:b/>
+                <w:bCs/>
+                <w:i/>
+                <w:iCs/>
+                <w:color w:val="EE0000"/>
+                <w:sz w:val="26"/>
+                <w:szCs w:val="26"/>
+              </w:rPr>
+              <w:t>1)</w:t>
+            </w:r>
           </w:p>
         </w:tc>
       </w:tr>
@@ -1685,6 +1931,32 @@
                 <w:szCs w:val="26"/>
               </w:rPr>
             </w:pPr>
+            <w:proofErr w:type="gramStart"/>
+            <w:r>
+              <w:rPr>
+                <w:b/>
+                <w:bCs/>
+                <w:i/>
+                <w:iCs/>
+                <w:color w:val="EE0000"/>
+                <w:sz w:val="26"/>
+                <w:szCs w:val="26"/>
+              </w:rPr>
+              <w:t>O(</w:t>
+            </w:r>
+            <w:proofErr w:type="gramEnd"/>
+            <w:r>
+              <w:rPr>
+                <w:b/>
+                <w:bCs/>
+                <w:i/>
+                <w:iCs/>
+                <w:color w:val="EE0000"/>
+                <w:sz w:val="26"/>
+                <w:szCs w:val="26"/>
+              </w:rPr>
+              <w:t>n^2)</w:t>
+            </w:r>
           </w:p>
         </w:tc>
       </w:tr>
@@ -1745,6 +2017,28 @@
                 <w:szCs w:val="26"/>
               </w:rPr>
             </w:pPr>
+            <w:proofErr w:type="gramStart"/>
+            <w:r>
+              <w:rPr>
+                <w:b/>
+                <w:bCs/>
+                <w:color w:val="EE0000"/>
+                <w:sz w:val="26"/>
+                <w:szCs w:val="26"/>
+              </w:rPr>
+              <w:t>O(</w:t>
+            </w:r>
+            <w:proofErr w:type="gramEnd"/>
+            <w:r>
+              <w:rPr>
+                <w:b/>
+                <w:bCs/>
+                <w:color w:val="EE0000"/>
+                <w:sz w:val="26"/>
+                <w:szCs w:val="26"/>
+              </w:rPr>
+              <w:t>log n)</w:t>
+            </w:r>
           </w:p>
         </w:tc>
       </w:tr>
@@ -1852,6 +2146,28 @@
                 <w:szCs w:val="26"/>
               </w:rPr>
             </w:pPr>
+            <w:proofErr w:type="gramStart"/>
+            <w:r>
+              <w:rPr>
+                <w:b/>
+                <w:bCs/>
+                <w:color w:val="EE0000"/>
+                <w:sz w:val="26"/>
+                <w:szCs w:val="26"/>
+              </w:rPr>
+              <w:t>O(</w:t>
+            </w:r>
+            <w:proofErr w:type="gramEnd"/>
+            <w:r>
+              <w:rPr>
+                <w:b/>
+                <w:bCs/>
+                <w:color w:val="EE0000"/>
+                <w:sz w:val="26"/>
+                <w:szCs w:val="26"/>
+              </w:rPr>
+              <w:t>n^2)</w:t>
+            </w:r>
           </w:p>
         </w:tc>
       </w:tr>
@@ -1932,6 +2248,16 @@
                 <w:szCs w:val="26"/>
               </w:rPr>
             </w:pPr>
+            <w:r>
+              <w:rPr>
+                <w:b/>
+                <w:bCs/>
+                <w:color w:val="EE0000"/>
+                <w:sz w:val="26"/>
+                <w:szCs w:val="26"/>
+              </w:rPr>
+              <w:t>O(n)</w:t>
+            </w:r>
           </w:p>
         </w:tc>
       </w:tr>
@@ -2056,6 +2382,28 @@
                 <w:szCs w:val="26"/>
               </w:rPr>
             </w:pPr>
+            <w:proofErr w:type="gramStart"/>
+            <w:r>
+              <w:rPr>
+                <w:b/>
+                <w:bCs/>
+                <w:color w:val="EE0000"/>
+                <w:sz w:val="26"/>
+                <w:szCs w:val="26"/>
+              </w:rPr>
+              <w:t>O(</w:t>
+            </w:r>
+            <w:proofErr w:type="gramEnd"/>
+            <w:r>
+              <w:rPr>
+                <w:b/>
+                <w:bCs/>
+                <w:color w:val="EE0000"/>
+                <w:sz w:val="26"/>
+                <w:szCs w:val="26"/>
+              </w:rPr>
+              <w:t>n^2)</w:t>
+            </w:r>
           </w:p>
         </w:tc>
       </w:tr>
@@ -2167,6 +2515,16 @@
                 <w:szCs w:val="26"/>
               </w:rPr>
             </w:pPr>
+            <w:r>
+              <w:rPr>
+                <w:b/>
+                <w:bCs/>
+                <w:color w:val="EE0000"/>
+                <w:sz w:val="26"/>
+                <w:szCs w:val="26"/>
+              </w:rPr>
+              <w:t>O(2^n)</w:t>
+            </w:r>
           </w:p>
         </w:tc>
       </w:tr>
@@ -2235,6 +2593,28 @@
                 <w:szCs w:val="26"/>
               </w:rPr>
             </w:pPr>
+            <w:proofErr w:type="gramStart"/>
+            <w:r>
+              <w:rPr>
+                <w:b/>
+                <w:bCs/>
+                <w:color w:val="EE0000"/>
+                <w:sz w:val="26"/>
+                <w:szCs w:val="26"/>
+              </w:rPr>
+              <w:t>O(</w:t>
+            </w:r>
+            <w:proofErr w:type="gramEnd"/>
+            <w:r>
+              <w:rPr>
+                <w:b/>
+                <w:bCs/>
+                <w:color w:val="EE0000"/>
+                <w:sz w:val="26"/>
+                <w:szCs w:val="26"/>
+              </w:rPr>
+              <w:t>n log n)</w:t>
+            </w:r>
           </w:p>
         </w:tc>
       </w:tr>
@@ -2315,6 +2695,16 @@
                 <w:szCs w:val="26"/>
               </w:rPr>
             </w:pPr>
+            <w:r>
+              <w:rPr>
+                <w:b/>
+                <w:bCs/>
+                <w:color w:val="EE0000"/>
+                <w:sz w:val="26"/>
+                <w:szCs w:val="26"/>
+              </w:rPr>
+              <w:t>O(2^n)</w:t>
+            </w:r>
           </w:p>
         </w:tc>
       </w:tr>
@@ -2407,6 +2797,32 @@
                 <w:szCs w:val="26"/>
               </w:rPr>
             </w:pPr>
+            <w:proofErr w:type="gramStart"/>
+            <w:r>
+              <w:rPr>
+                <w:b/>
+                <w:bCs/>
+                <w:i/>
+                <w:iCs/>
+                <w:color w:val="EE0000"/>
+                <w:sz w:val="26"/>
+                <w:szCs w:val="26"/>
+              </w:rPr>
+              <w:t>O(</w:t>
+            </w:r>
+            <w:proofErr w:type="gramEnd"/>
+            <w:r>
+              <w:rPr>
+                <w:b/>
+                <w:bCs/>
+                <w:i/>
+                <w:iCs/>
+                <w:color w:val="EE0000"/>
+                <w:sz w:val="26"/>
+                <w:szCs w:val="26"/>
+              </w:rPr>
+              <w:t>n^2)</w:t>
+            </w:r>
           </w:p>
         </w:tc>
       </w:tr>
@@ -2522,6 +2938,18 @@
                 <w:szCs w:val="26"/>
               </w:rPr>
             </w:pPr>
+            <w:r>
+              <w:rPr>
+                <w:b/>
+                <w:bCs/>
+                <w:i/>
+                <w:iCs/>
+                <w:color w:val="EE0000"/>
+                <w:sz w:val="26"/>
+                <w:szCs w:val="26"/>
+              </w:rPr>
+              <w:t>O(n^3)</w:t>
+            </w:r>
           </w:p>
         </w:tc>
       </w:tr>
@@ -2570,6 +2998,21 @@
         <w:spacing w:before="120" w:line="264" w:lineRule="auto"/>
       </w:pPr>
       <w:r>
+        <w:rPr>
+          <w:color w:val="EE0000"/>
+        </w:rPr>
+        <w:t>#</w:t>
+      </w:r>
+      <w:r>
+        <w:rPr>
+          <w:color w:val="EE0000"/>
+        </w:rPr>
+        <w:t>7</w:t>
+      </w:r>
+      <w:r>
+        <w:t xml:space="preserve">     </w:t>
+      </w:r>
+      <w:r>
         <w:t>250</w:t>
       </w:r>
     </w:p>
@@ -2583,6 +3026,21 @@
         <w:spacing w:before="120" w:line="264" w:lineRule="auto"/>
       </w:pPr>
       <w:r>
+        <w:rPr>
+          <w:color w:val="EE0000"/>
+        </w:rPr>
+        <w:t>#</w:t>
+      </w:r>
+      <w:r>
+        <w:rPr>
+          <w:color w:val="EE0000"/>
+        </w:rPr>
+        <w:t>2</w:t>
+      </w:r>
+      <w:r>
+        <w:t xml:space="preserve">     </w:t>
+      </w:r>
+      <w:r>
         <w:t>3</w:t>
       </w:r>
       <w:r>
@@ -2602,6 +3060,21 @@
         <w:spacing w:before="120" w:line="264" w:lineRule="auto"/>
       </w:pPr>
       <w:r>
+        <w:rPr>
+          <w:color w:val="EE0000"/>
+        </w:rPr>
+        <w:t>#</w:t>
+      </w:r>
+      <w:r>
+        <w:rPr>
+          <w:color w:val="EE0000"/>
+        </w:rPr>
+        <w:t>5</w:t>
+      </w:r>
+      <w:r>
+        <w:t xml:space="preserve">     </w:t>
+      </w:r>
+      <w:r>
         <w:t>10n</w:t>
       </w:r>
     </w:p>
@@ -2615,6 +3088,21 @@
         <w:spacing w:before="120" w:line="264" w:lineRule="auto"/>
       </w:pPr>
       <w:r>
+        <w:rPr>
+          <w:color w:val="EE0000"/>
+        </w:rPr>
+        <w:t>#</w:t>
+      </w:r>
+      <w:r>
+        <w:rPr>
+          <w:color w:val="EE0000"/>
+        </w:rPr>
+        <w:t>1</w:t>
+      </w:r>
+      <w:r>
+        <w:t xml:space="preserve">     </w:t>
+      </w:r>
+      <w:r>
         <w:t>5n!</w:t>
       </w:r>
     </w:p>
@@ -2628,6 +3116,21 @@
         <w:spacing w:before="120" w:line="264" w:lineRule="auto"/>
       </w:pPr>
       <w:r>
+        <w:rPr>
+          <w:color w:val="EE0000"/>
+        </w:rPr>
+        <w:t>#</w:t>
+      </w:r>
+      <w:r>
+        <w:rPr>
+          <w:color w:val="EE0000"/>
+        </w:rPr>
+        <w:t>3</w:t>
+      </w:r>
+      <w:r>
+        <w:t xml:space="preserve">     </w:t>
+      </w:r>
+      <w:r>
         <w:t>7n</w:t>
       </w:r>
       <w:r>
@@ -2647,6 +3150,21 @@
         <w:spacing w:before="120" w:line="264" w:lineRule="auto"/>
       </w:pPr>
       <w:r>
+        <w:rPr>
+          <w:color w:val="EE0000"/>
+        </w:rPr>
+        <w:t>#</w:t>
+      </w:r>
+      <w:r>
+        <w:rPr>
+          <w:color w:val="EE0000"/>
+        </w:rPr>
+        <w:t>6</w:t>
+      </w:r>
+      <w:r>
+        <w:t xml:space="preserve">     </w:t>
+      </w:r>
+      <w:r>
         <w:t>3 log₂ n</w:t>
       </w:r>
     </w:p>
@@ -2660,6 +3178,21 @@
         <w:spacing w:before="120" w:line="264" w:lineRule="auto"/>
       </w:pPr>
       <w:r>
+        <w:rPr>
+          <w:color w:val="EE0000"/>
+        </w:rPr>
+        <w:t>#</w:t>
+      </w:r>
+      <w:r>
+        <w:rPr>
+          <w:color w:val="EE0000"/>
+        </w:rPr>
+        <w:t>4</w:t>
+      </w:r>
+      <w:r>
+        <w:t xml:space="preserve">     </w:t>
+      </w:r>
+      <w:r>
         <w:t>2n log₂ n</w:t>
       </w:r>
     </w:p>
@@ -2962,6 +3495,13 @@
         </w:rPr>
         <w:t xml:space="preserve"> </w:t>
       </w:r>
+      <w:r>
+        <w:rPr>
+          <w:rFonts w:ascii="QuickType Mono" w:hAnsi="QuickType Mono" w:cs="Courier New"/>
+          <w:color w:val="EE0000"/>
+        </w:rPr>
+        <w:t>O(n)</w:t>
+      </w:r>
     </w:p>
     <w:p>
       <w:pPr>
@@ -3150,11 +3690,40 @@
     </w:p>
     <w:p>
       <w:pPr>
-        <w:ind w:left="540" w:right="-1719" w:firstLine="357"/>
-        <w:rPr>
-          <w:rFonts w:ascii="QuickType Mono" w:hAnsi="QuickType Mono" w:cs="Courier New"/>
-        </w:rPr>
-      </w:pPr>
+        <w:ind w:right="-1719"/>
+        <w:rPr>
+          <w:rFonts w:ascii="QuickType Mono" w:hAnsi="QuickType Mono" w:cs="Courier New"/>
+        </w:rPr>
+      </w:pPr>
+      <w:r>
+        <w:rPr>
+          <w:rFonts w:ascii="QuickType Mono" w:hAnsi="QuickType Mono" w:cs="Courier New"/>
+        </w:rPr>
+        <w:tab/>
+      </w:r>
+      <w:proofErr w:type="gramStart"/>
+      <w:r>
+        <w:rPr>
+          <w:rFonts w:ascii="QuickType Mono" w:hAnsi="QuickType Mono" w:cs="Courier New"/>
+          <w:color w:val="EE0000"/>
+        </w:rPr>
+        <w:t>O(</w:t>
+      </w:r>
+      <w:proofErr w:type="gramEnd"/>
+      <w:r>
+        <w:rPr>
+          <w:rFonts w:ascii="QuickType Mono" w:hAnsi="QuickType Mono" w:cs="Courier New"/>
+          <w:color w:val="EE0000"/>
+        </w:rPr>
+        <w:t>n^2</w:t>
+      </w:r>
+      <w:r>
+        <w:rPr>
+          <w:rFonts w:ascii="QuickType Mono" w:hAnsi="QuickType Mono" w:cs="Courier New"/>
+          <w:color w:val="EE0000"/>
+        </w:rPr>
+        <w:t>)</w:t>
+      </w:r>
     </w:p>
     <w:p>
       <w:pPr>
@@ -3342,15 +3911,42 @@
       <w:pPr>
         <w:rPr>
           <w:rFonts w:ascii="QuickType Mono" w:hAnsi="QuickType Mono" w:cs="Courier New"/>
+        </w:rPr>
+      </w:pPr>
+      <w:r>
+        <w:rPr>
+          <w:rFonts w:ascii="QuickType Mono" w:hAnsi="QuickType Mono" w:cs="Courier New"/>
           <w:b/>
           <w:bCs/>
         </w:rPr>
-      </w:pPr>
-      <w:r>
-        <w:rPr>
-          <w:rFonts w:ascii="QuickType Mono" w:hAnsi="QuickType Mono" w:cs="Courier New"/>
-          <w:b/>
-          <w:bCs/>
+        <w:tab/>
+      </w:r>
+      <w:proofErr w:type="gramStart"/>
+      <w:r>
+        <w:rPr>
+          <w:rFonts w:ascii="QuickType Mono" w:hAnsi="QuickType Mono" w:cs="Courier New"/>
+          <w:color w:val="EE0000"/>
+        </w:rPr>
+        <w:t>O(</w:t>
+      </w:r>
+      <w:proofErr w:type="gramEnd"/>
+      <w:r>
+        <w:rPr>
+          <w:rFonts w:ascii="QuickType Mono" w:hAnsi="QuickType Mono" w:cs="Courier New"/>
+          <w:color w:val="EE0000"/>
+        </w:rPr>
+        <w:t>n^2</w:t>
+      </w:r>
+      <w:r>
+        <w:rPr>
+          <w:rFonts w:ascii="QuickType Mono" w:hAnsi="QuickType Mono" w:cs="Courier New"/>
+          <w:color w:val="EE0000"/>
+        </w:rPr>
+        <w:t>)</w:t>
+      </w:r>
+      <w:r>
+        <w:rPr>
+          <w:rFonts w:ascii="QuickType Mono" w:hAnsi="QuickType Mono" w:cs="Courier New"/>
         </w:rPr>
         <w:br w:type="page"/>
       </w:r>
@@ -3393,7 +3989,7 @@
         <w:rPr>
           <w:rFonts w:ascii="QuickType Mono" w:hAnsi="QuickType Mono" w:cs="Courier New"/>
         </w:rPr>
-        <w:t xml:space="preserve">=n; i&gt;0; </w:t>
+        <w:t xml:space="preserve">=n; </w:t>
       </w:r>
       <w:proofErr w:type="spellStart"/>
       <w:r>
@@ -3407,6 +4003,20 @@
         <w:rPr>
           <w:rFonts w:ascii="QuickType Mono" w:hAnsi="QuickType Mono" w:cs="Courier New"/>
         </w:rPr>
+        <w:t xml:space="preserve">&gt;0; </w:t>
+      </w:r>
+      <w:proofErr w:type="spellStart"/>
+      <w:r>
+        <w:rPr>
+          <w:rFonts w:ascii="QuickType Mono" w:hAnsi="QuickType Mono" w:cs="Courier New"/>
+        </w:rPr>
+        <w:t>i</w:t>
+      </w:r>
+      <w:proofErr w:type="spellEnd"/>
+      <w:r>
+        <w:rPr>
+          <w:rFonts w:ascii="QuickType Mono" w:hAnsi="QuickType Mono" w:cs="Courier New"/>
+        </w:rPr>
         <w:t>=</w:t>
       </w:r>
       <w:proofErr w:type="spellStart"/>
@@ -3468,11 +4078,40 @@
     </w:p>
     <w:p>
       <w:pPr>
-        <w:ind w:left="540" w:right="-1719" w:firstLine="357"/>
-        <w:rPr>
-          <w:rFonts w:ascii="QuickType Mono" w:hAnsi="QuickType Mono" w:cs="Courier New"/>
-        </w:rPr>
-      </w:pPr>
+        <w:ind w:right="-1719"/>
+        <w:rPr>
+          <w:rFonts w:ascii="QuickType Mono" w:hAnsi="QuickType Mono" w:cs="Courier New"/>
+        </w:rPr>
+      </w:pPr>
+      <w:r>
+        <w:rPr>
+          <w:rFonts w:ascii="QuickType Mono" w:hAnsi="QuickType Mono" w:cs="Courier New"/>
+        </w:rPr>
+        <w:tab/>
+      </w:r>
+      <w:proofErr w:type="gramStart"/>
+      <w:r>
+        <w:rPr>
+          <w:rFonts w:ascii="QuickType Mono" w:hAnsi="QuickType Mono" w:cs="Courier New"/>
+          <w:color w:val="EE0000"/>
+        </w:rPr>
+        <w:t>O(</w:t>
+      </w:r>
+      <w:proofErr w:type="gramEnd"/>
+      <w:r>
+        <w:rPr>
+          <w:rFonts w:ascii="QuickType Mono" w:hAnsi="QuickType Mono" w:cs="Courier New"/>
+          <w:color w:val="EE0000"/>
+        </w:rPr>
+        <w:t>log n</w:t>
+      </w:r>
+      <w:r>
+        <w:rPr>
+          <w:rFonts w:ascii="QuickType Mono" w:hAnsi="QuickType Mono" w:cs="Courier New"/>
+          <w:color w:val="EE0000"/>
+        </w:rPr>
+        <w:t>)</w:t>
+      </w:r>
       <w:r>
         <w:rPr>
           <w:rFonts w:ascii="QuickType Mono" w:hAnsi="QuickType Mono" w:cs="Courier New"/>
@@ -3698,11 +4337,40 @@
     </w:p>
     <w:p>
       <w:pPr>
-        <w:ind w:left="540" w:right="-1719" w:firstLine="357"/>
-        <w:rPr>
-          <w:rFonts w:ascii="QuickType Mono" w:hAnsi="QuickType Mono" w:cs="Courier New"/>
-        </w:rPr>
-      </w:pPr>
+        <w:ind w:right="-1719"/>
+        <w:rPr>
+          <w:rFonts w:ascii="QuickType Mono" w:hAnsi="QuickType Mono" w:cs="Courier New"/>
+        </w:rPr>
+      </w:pPr>
+      <w:r>
+        <w:rPr>
+          <w:rFonts w:ascii="QuickType Mono" w:hAnsi="QuickType Mono" w:cs="Courier New"/>
+        </w:rPr>
+        <w:tab/>
+      </w:r>
+      <w:proofErr w:type="gramStart"/>
+      <w:r>
+        <w:rPr>
+          <w:rFonts w:ascii="QuickType Mono" w:hAnsi="QuickType Mono" w:cs="Courier New"/>
+          <w:color w:val="EE0000"/>
+        </w:rPr>
+        <w:t>O(</w:t>
+      </w:r>
+      <w:proofErr w:type="gramEnd"/>
+      <w:r>
+        <w:rPr>
+          <w:rFonts w:ascii="QuickType Mono" w:hAnsi="QuickType Mono" w:cs="Courier New"/>
+          <w:color w:val="EE0000"/>
+        </w:rPr>
+        <w:t>n log n</w:t>
+      </w:r>
+      <w:r>
+        <w:rPr>
+          <w:rFonts w:ascii="QuickType Mono" w:hAnsi="QuickType Mono" w:cs="Courier New"/>
+          <w:color w:val="EE0000"/>
+        </w:rPr>
+        <w:t>)</w:t>
+      </w:r>
       <w:r>
         <w:rPr>
           <w:rFonts w:ascii="QuickType Mono" w:hAnsi="QuickType Mono" w:cs="Courier New"/>
@@ -3844,11 +4512,40 @@
     </w:p>
     <w:p>
       <w:pPr>
-        <w:ind w:left="540" w:right="-1719" w:firstLine="357"/>
-        <w:rPr>
-          <w:rFonts w:ascii="QuickType Mono" w:hAnsi="QuickType Mono" w:cs="Courier New"/>
-        </w:rPr>
-      </w:pPr>
+        <w:ind w:right="-1719"/>
+        <w:rPr>
+          <w:rFonts w:ascii="QuickType Mono" w:hAnsi="QuickType Mono" w:cs="Courier New"/>
+        </w:rPr>
+      </w:pPr>
+      <w:r>
+        <w:rPr>
+          <w:rFonts w:ascii="QuickType Mono" w:hAnsi="QuickType Mono" w:cs="Courier New"/>
+        </w:rPr>
+        <w:tab/>
+      </w:r>
+      <w:proofErr w:type="gramStart"/>
+      <w:r>
+        <w:rPr>
+          <w:rFonts w:ascii="QuickType Mono" w:hAnsi="QuickType Mono" w:cs="Courier New"/>
+          <w:color w:val="EE0000"/>
+        </w:rPr>
+        <w:t>O(</w:t>
+      </w:r>
+      <w:proofErr w:type="gramEnd"/>
+      <w:r>
+        <w:rPr>
+          <w:rFonts w:ascii="QuickType Mono" w:hAnsi="QuickType Mono" w:cs="Courier New"/>
+          <w:color w:val="EE0000"/>
+        </w:rPr>
+        <w:t>log n</w:t>
+      </w:r>
+      <w:r>
+        <w:rPr>
+          <w:rFonts w:ascii="QuickType Mono" w:hAnsi="QuickType Mono" w:cs="Courier New"/>
+          <w:color w:val="EE0000"/>
+        </w:rPr>
+        <w:t>)</w:t>
+      </w:r>
     </w:p>
     <w:p>
       <w:pPr>
@@ -3992,6 +4689,29 @@
       <w:pPr>
         <w:ind w:right="-1719"/>
         <w:rPr>
+          <w:rFonts w:ascii="QuickType Mono" w:hAnsi="QuickType Mono" w:cs="Courier New"/>
+          <w:sz w:val="22"/>
+        </w:rPr>
+      </w:pPr>
+      <w:r>
+        <w:rPr>
+          <w:rFonts w:ascii="QuickType Mono" w:hAnsi="QuickType Mono" w:cs="Courier New"/>
+          <w:sz w:val="22"/>
+        </w:rPr>
+        <w:t xml:space="preserve">       </w:t>
+      </w:r>
+      <w:r>
+        <w:rPr>
+          <w:rFonts w:ascii="QuickType Mono" w:hAnsi="QuickType Mono" w:cs="Courier New"/>
+          <w:sz w:val="22"/>
+        </w:rPr>
+        <w:t>}</w:t>
+      </w:r>
+    </w:p>
+    <w:p>
+      <w:pPr>
+        <w:ind w:right="-1719"/>
+        <w:rPr>
           <w:lang w:val="en-CA"/>
         </w:rPr>
       </w:pPr>
@@ -4000,14 +4720,30 @@
           <w:rFonts w:ascii="QuickType Mono" w:hAnsi="QuickType Mono" w:cs="Courier New"/>
           <w:sz w:val="22"/>
         </w:rPr>
-        <w:t xml:space="preserve">       </w:t>
-      </w:r>
-      <w:r>
-        <w:rPr>
-          <w:rFonts w:ascii="QuickType Mono" w:hAnsi="QuickType Mono" w:cs="Courier New"/>
-          <w:sz w:val="22"/>
-        </w:rPr>
-        <w:t>}</w:t>
+        <w:tab/>
+      </w:r>
+      <w:proofErr w:type="gramStart"/>
+      <w:r>
+        <w:rPr>
+          <w:rFonts w:ascii="QuickType Mono" w:hAnsi="QuickType Mono" w:cs="Courier New"/>
+          <w:color w:val="EE0000"/>
+        </w:rPr>
+        <w:t>O(</w:t>
+      </w:r>
+      <w:proofErr w:type="gramEnd"/>
+      <w:r>
+        <w:rPr>
+          <w:rFonts w:ascii="QuickType Mono" w:hAnsi="QuickType Mono" w:cs="Courier New"/>
+          <w:color w:val="EE0000"/>
+        </w:rPr>
+        <w:t>n log n</w:t>
+      </w:r>
+      <w:r>
+        <w:rPr>
+          <w:rFonts w:ascii="QuickType Mono" w:hAnsi="QuickType Mono" w:cs="Courier New"/>
+          <w:color w:val="EE0000"/>
+        </w:rPr>
+        <w:t>)</w:t>
       </w:r>
       <w:r>
         <w:rPr>
@@ -4871,6 +5607,118 @@
     </w:lvl>
   </w:abstractNum>
   <w:abstractNum w:abstractNumId="4" w15:restartNumberingAfterBreak="0">
+    <w:nsid w:val="21D34701"/>
+    <w:multiLevelType w:val="hybridMultilevel"/>
+    <w:tmpl w:val="F064D638"/>
+    <w:lvl w:ilvl="0" w:tplc="23D06592">
+      <w:numFmt w:val="bullet"/>
+      <w:lvlText w:val="-"/>
+      <w:lvlJc w:val="left"/>
+      <w:pPr>
+        <w:ind w:left="720" w:hanging="360"/>
+      </w:pPr>
+      <w:rPr>
+        <w:rFonts w:ascii="Times New Roman" w:eastAsia="Times New Roman" w:hAnsi="Times New Roman" w:cs="Times New Roman" w:hint="default"/>
+      </w:rPr>
+    </w:lvl>
+    <w:lvl w:ilvl="1" w:tplc="10090003" w:tentative="1">
+      <w:start w:val="1"/>
+      <w:numFmt w:val="bullet"/>
+      <w:lvlText w:val="o"/>
+      <w:lvlJc w:val="left"/>
+      <w:pPr>
+        <w:ind w:left="1440" w:hanging="360"/>
+      </w:pPr>
+      <w:rPr>
+        <w:rFonts w:ascii="Courier New" w:hAnsi="Courier New" w:cs="Courier New" w:hint="default"/>
+      </w:rPr>
+    </w:lvl>
+    <w:lvl w:ilvl="2" w:tplc="10090005" w:tentative="1">
+      <w:start w:val="1"/>
+      <w:numFmt w:val="bullet"/>
+      <w:lvlText w:val=""/>
+      <w:lvlJc w:val="left"/>
+      <w:pPr>
+        <w:ind w:left="2160" w:hanging="360"/>
+      </w:pPr>
+      <w:rPr>
+        <w:rFonts w:ascii="Wingdings" w:hAnsi="Wingdings" w:hint="default"/>
+      </w:rPr>
+    </w:lvl>
+    <w:lvl w:ilvl="3" w:tplc="10090001" w:tentative="1">
+      <w:start w:val="1"/>
+      <w:numFmt w:val="bullet"/>
+      <w:lvlText w:val=""/>
+      <w:lvlJc w:val="left"/>
+      <w:pPr>
+        <w:ind w:left="2880" w:hanging="360"/>
+      </w:pPr>
+      <w:rPr>
+        <w:rFonts w:ascii="Symbol" w:hAnsi="Symbol" w:hint="default"/>
+      </w:rPr>
+    </w:lvl>
+    <w:lvl w:ilvl="4" w:tplc="10090003" w:tentative="1">
+      <w:start w:val="1"/>
+      <w:numFmt w:val="bullet"/>
+      <w:lvlText w:val="o"/>
+      <w:lvlJc w:val="left"/>
+      <w:pPr>
+        <w:ind w:left="3600" w:hanging="360"/>
+      </w:pPr>
+      <w:rPr>
+        <w:rFonts w:ascii="Courier New" w:hAnsi="Courier New" w:cs="Courier New" w:hint="default"/>
+      </w:rPr>
+    </w:lvl>
+    <w:lvl w:ilvl="5" w:tplc="10090005" w:tentative="1">
+      <w:start w:val="1"/>
+      <w:numFmt w:val="bullet"/>
+      <w:lvlText w:val=""/>
+      <w:lvlJc w:val="left"/>
+      <w:pPr>
+        <w:ind w:left="4320" w:hanging="360"/>
+      </w:pPr>
+      <w:rPr>
+        <w:rFonts w:ascii="Wingdings" w:hAnsi="Wingdings" w:hint="default"/>
+      </w:rPr>
+    </w:lvl>
+    <w:lvl w:ilvl="6" w:tplc="10090001" w:tentative="1">
+      <w:start w:val="1"/>
+      <w:numFmt w:val="bullet"/>
+      <w:lvlText w:val=""/>
+      <w:lvlJc w:val="left"/>
+      <w:pPr>
+        <w:ind w:left="5040" w:hanging="360"/>
+      </w:pPr>
+      <w:rPr>
+        <w:rFonts w:ascii="Symbol" w:hAnsi="Symbol" w:hint="default"/>
+      </w:rPr>
+    </w:lvl>
+    <w:lvl w:ilvl="7" w:tplc="10090003" w:tentative="1">
+      <w:start w:val="1"/>
+      <w:numFmt w:val="bullet"/>
+      <w:lvlText w:val="o"/>
+      <w:lvlJc w:val="left"/>
+      <w:pPr>
+        <w:ind w:left="5760" w:hanging="360"/>
+      </w:pPr>
+      <w:rPr>
+        <w:rFonts w:ascii="Courier New" w:hAnsi="Courier New" w:cs="Courier New" w:hint="default"/>
+      </w:rPr>
+    </w:lvl>
+    <w:lvl w:ilvl="8" w:tplc="10090005" w:tentative="1">
+      <w:start w:val="1"/>
+      <w:numFmt w:val="bullet"/>
+      <w:lvlText w:val=""/>
+      <w:lvlJc w:val="left"/>
+      <w:pPr>
+        <w:ind w:left="6480" w:hanging="360"/>
+      </w:pPr>
+      <w:rPr>
+        <w:rFonts w:ascii="Wingdings" w:hAnsi="Wingdings" w:hint="default"/>
+      </w:rPr>
+    </w:lvl>
+  </w:abstractNum>
+  <w:abstractNum w:abstractNumId="5" w15:restartNumberingAfterBreak="0">
     <w:nsid w:val="352A3799"/>
     <w:multiLevelType w:val="hybridMultilevel"/>
     <w:tmpl w:val="4850863E"/>
@@ -4986,7 +5834,7 @@
       </w:pPr>
     </w:lvl>
   </w:abstractNum>
-  <w:abstractNum w:abstractNumId="5" w15:restartNumberingAfterBreak="0">
+  <w:abstractNum w:abstractNumId="6" w15:restartNumberingAfterBreak="0">
     <w:nsid w:val="39647540"/>
     <w:multiLevelType w:val="hybridMultilevel"/>
     <w:tmpl w:val="8DA0CB20"/>
@@ -5102,7 +5950,7 @@
       </w:pPr>
     </w:lvl>
   </w:abstractNum>
-  <w:abstractNum w:abstractNumId="6" w15:restartNumberingAfterBreak="0">
+  <w:abstractNum w:abstractNumId="7" w15:restartNumberingAfterBreak="0">
     <w:nsid w:val="3AD532F9"/>
     <w:multiLevelType w:val="hybridMultilevel"/>
     <w:tmpl w:val="86143150"/>
@@ -5215,7 +6063,7 @@
       </w:pPr>
     </w:lvl>
   </w:abstractNum>
-  <w:abstractNum w:abstractNumId="7" w15:restartNumberingAfterBreak="0">
+  <w:abstractNum w:abstractNumId="8" w15:restartNumberingAfterBreak="0">
     <w:nsid w:val="451D2C70"/>
     <w:multiLevelType w:val="hybridMultilevel"/>
     <w:tmpl w:val="2146BE9E"/>
@@ -5331,7 +6179,7 @@
       </w:pPr>
     </w:lvl>
   </w:abstractNum>
-  <w:abstractNum w:abstractNumId="8" w15:restartNumberingAfterBreak="0">
+  <w:abstractNum w:abstractNumId="9" w15:restartNumberingAfterBreak="0">
     <w:nsid w:val="473E6B42"/>
     <w:multiLevelType w:val="hybridMultilevel"/>
     <w:tmpl w:val="4C24826A"/>
@@ -5447,7 +6295,7 @@
       </w:pPr>
     </w:lvl>
   </w:abstractNum>
-  <w:abstractNum w:abstractNumId="9" w15:restartNumberingAfterBreak="0">
+  <w:abstractNum w:abstractNumId="10" w15:restartNumberingAfterBreak="0">
     <w:nsid w:val="4A93296D"/>
     <w:multiLevelType w:val="hybridMultilevel"/>
     <w:tmpl w:val="50F2B8A0"/>
@@ -5560,7 +6408,7 @@
       </w:rPr>
     </w:lvl>
   </w:abstractNum>
-  <w:abstractNum w:abstractNumId="10" w15:restartNumberingAfterBreak="0">
+  <w:abstractNum w:abstractNumId="11" w15:restartNumberingAfterBreak="0">
     <w:nsid w:val="4C7C056E"/>
     <w:multiLevelType w:val="hybridMultilevel"/>
     <w:tmpl w:val="1C6E03DA"/>
@@ -5649,7 +6497,7 @@
       </w:pPr>
     </w:lvl>
   </w:abstractNum>
-  <w:abstractNum w:abstractNumId="11" w15:restartNumberingAfterBreak="0">
+  <w:abstractNum w:abstractNumId="12" w15:restartNumberingAfterBreak="0">
     <w:nsid w:val="4F9B347F"/>
     <w:multiLevelType w:val="hybridMultilevel"/>
     <w:tmpl w:val="529A485C"/>
@@ -5789,7 +6637,7 @@
       </w:rPr>
     </w:lvl>
   </w:abstractNum>
-  <w:abstractNum w:abstractNumId="12" w15:restartNumberingAfterBreak="0">
+  <w:abstractNum w:abstractNumId="13" w15:restartNumberingAfterBreak="0">
     <w:nsid w:val="5C6A0CC8"/>
     <w:multiLevelType w:val="hybridMultilevel"/>
     <w:tmpl w:val="FDE8569E"/>
@@ -5929,7 +6777,7 @@
       </w:rPr>
     </w:lvl>
   </w:abstractNum>
-  <w:abstractNum w:abstractNumId="13" w15:restartNumberingAfterBreak="0">
+  <w:abstractNum w:abstractNumId="14" w15:restartNumberingAfterBreak="0">
     <w:nsid w:val="63A462CA"/>
     <w:multiLevelType w:val="hybridMultilevel"/>
     <w:tmpl w:val="3D8808F8"/>
@@ -6069,7 +6917,7 @@
       </w:rPr>
     </w:lvl>
   </w:abstractNum>
-  <w:abstractNum w:abstractNumId="14" w15:restartNumberingAfterBreak="0">
+  <w:abstractNum w:abstractNumId="15" w15:restartNumberingAfterBreak="0">
     <w:nsid w:val="6B4338E0"/>
     <w:multiLevelType w:val="hybridMultilevel"/>
     <w:tmpl w:val="61C8C32C"/>
@@ -6185,7 +7033,7 @@
       </w:pPr>
     </w:lvl>
   </w:abstractNum>
-  <w:abstractNum w:abstractNumId="15" w15:restartNumberingAfterBreak="0">
+  <w:abstractNum w:abstractNumId="16" w15:restartNumberingAfterBreak="0">
     <w:nsid w:val="6EBA1AAD"/>
     <w:multiLevelType w:val="hybridMultilevel"/>
     <w:tmpl w:val="24F6362A"/>
@@ -6301,7 +7149,7 @@
       </w:pPr>
     </w:lvl>
   </w:abstractNum>
-  <w:abstractNum w:abstractNumId="16" w15:restartNumberingAfterBreak="0">
+  <w:abstractNum w:abstractNumId="17" w15:restartNumberingAfterBreak="0">
     <w:nsid w:val="7AD75E4A"/>
     <w:multiLevelType w:val="hybridMultilevel"/>
     <w:tmpl w:val="F29A7D42"/>
@@ -6417,7 +7265,7 @@
       </w:pPr>
     </w:lvl>
   </w:abstractNum>
-  <w:abstractNum w:abstractNumId="17" w15:restartNumberingAfterBreak="0">
+  <w:abstractNum w:abstractNumId="18" w15:restartNumberingAfterBreak="0">
     <w:nsid w:val="7C481C9F"/>
     <w:multiLevelType w:val="hybridMultilevel"/>
     <w:tmpl w:val="D13EE84A"/>
@@ -6534,7 +7382,7 @@
       </w:pPr>
     </w:lvl>
   </w:abstractNum>
-  <w:abstractNum w:abstractNumId="18" w15:restartNumberingAfterBreak="0">
+  <w:abstractNum w:abstractNumId="19" w15:restartNumberingAfterBreak="0">
     <w:nsid w:val="7CFA495E"/>
     <w:multiLevelType w:val="hybridMultilevel"/>
     <w:tmpl w:val="99A285F8"/>
@@ -6678,58 +7526,61 @@
     <w:abstractNumId w:val="1"/>
   </w:num>
   <w:num w:numId="2" w16cid:durableId="1062218038">
-    <w:abstractNumId w:val="8"/>
+    <w:abstractNumId w:val="9"/>
   </w:num>
   <w:num w:numId="3" w16cid:durableId="1550191545">
     <w:abstractNumId w:val="2"/>
   </w:num>
   <w:num w:numId="4" w16cid:durableId="1579898971">
-    <w:abstractNumId w:val="14"/>
+    <w:abstractNumId w:val="15"/>
   </w:num>
   <w:num w:numId="5" w16cid:durableId="1243300598">
-    <w:abstractNumId w:val="4"/>
+    <w:abstractNumId w:val="5"/>
   </w:num>
   <w:num w:numId="6" w16cid:durableId="1780752958">
-    <w:abstractNumId w:val="15"/>
+    <w:abstractNumId w:val="16"/>
   </w:num>
   <w:num w:numId="7" w16cid:durableId="1117336149">
-    <w:abstractNumId w:val="7"/>
+    <w:abstractNumId w:val="8"/>
   </w:num>
   <w:num w:numId="8" w16cid:durableId="2088838310">
-    <w:abstractNumId w:val="16"/>
+    <w:abstractNumId w:val="17"/>
   </w:num>
   <w:num w:numId="9" w16cid:durableId="1670256228">
-    <w:abstractNumId w:val="5"/>
+    <w:abstractNumId w:val="6"/>
   </w:num>
   <w:num w:numId="10" w16cid:durableId="1536042630">
-    <w:abstractNumId w:val="17"/>
+    <w:abstractNumId w:val="18"/>
   </w:num>
   <w:num w:numId="11" w16cid:durableId="809135448">
     <w:abstractNumId w:val="3"/>
   </w:num>
   <w:num w:numId="12" w16cid:durableId="411703835">
-    <w:abstractNumId w:val="18"/>
+    <w:abstractNumId w:val="19"/>
   </w:num>
   <w:num w:numId="13" w16cid:durableId="2146191979">
+    <w:abstractNumId w:val="13"/>
+  </w:num>
+  <w:num w:numId="14" w16cid:durableId="1705054145">
+    <w:abstractNumId w:val="14"/>
+  </w:num>
+  <w:num w:numId="15" w16cid:durableId="1611736236">
     <w:abstractNumId w:val="12"/>
   </w:num>
-  <w:num w:numId="14" w16cid:durableId="1705054145">
-    <w:abstractNumId w:val="13"/>
-  </w:num>
-  <w:num w:numId="15" w16cid:durableId="1611736236">
-    <w:abstractNumId w:val="11"/>
-  </w:num>
   <w:num w:numId="16" w16cid:durableId="1539270812">
-    <w:abstractNumId w:val="6"/>
+    <w:abstractNumId w:val="7"/>
   </w:num>
   <w:num w:numId="17" w16cid:durableId="177736182">
-    <w:abstractNumId w:val="10"/>
+    <w:abstractNumId w:val="11"/>
   </w:num>
   <w:num w:numId="18" w16cid:durableId="1865944738">
     <w:abstractNumId w:val="0"/>
   </w:num>
   <w:num w:numId="19" w16cid:durableId="518012436">
-    <w:abstractNumId w:val="9"/>
+    <w:abstractNumId w:val="10"/>
+  </w:num>
+  <w:num w:numId="20" w16cid:durableId="578712737">
+    <w:abstractNumId w:val="4"/>
   </w:num>
 </w:numbering>
 </file>
@@ -7277,6 +8128,16 @@
       <w:contextualSpacing/>
     </w:pPr>
   </w:style>
+  <w:style w:type="character" w:styleId="PlaceholderText">
+    <w:name w:val="Placeholder Text"/>
+    <w:basedOn w:val="DefaultParagraphFont"/>
+    <w:uiPriority w:val="99"/>
+    <w:semiHidden/>
+    <w:rsid w:val="00DD4450"/>
+    <w:rPr>
+      <w:color w:val="666666"/>
+    </w:rPr>
+  </w:style>
 </w:styles>
 </file>
 

</xml_diff>